<commit_message>
Added Verification & Testing document
</commit_message>
<xml_diff>
--- a/documentation/Revision of Success Criterion - Project INSOLE.docx
+++ b/documentation/Revision of Success Criterion - Project INSOLE.docx
@@ -434,14 +434,7 @@
                 <w:sz w:val="20"/>
                 <w:szCs w:val="20"/>
               </w:rPr>
-              <w:t>P</w:t>
-            </w:r>
-            <w:r>
-              <w:rPr>
-                <w:sz w:val="20"/>
-                <w:szCs w:val="20"/>
-              </w:rPr>
-              <w:t>ENDING</w:t>
+              <w:t>COMPLETED</w:t>
             </w:r>
           </w:p>
         </w:tc>
@@ -671,15 +664,7 @@
         <w:jc w:val="both"/>
       </w:pPr>
       <w:r>
-        <w:t xml:space="preserve">The five clinical classes are defined by the project brief in terms of arch height in </w:t>
-      </w:r>
-      <w:proofErr w:type="spellStart"/>
-      <w:r>
-        <w:t>centimetres</w:t>
-      </w:r>
-      <w:proofErr w:type="spellEnd"/>
-      <w:r>
-        <w:t xml:space="preserve"> (Severe Flat &lt; 2.7; Flat 2.7–3.5; Normal 3.6–5.5; High 5.6–6.4; Severe High &gt; 6.4). The ground-truth label is therefore a deterministic function of a single measured quantity. A controlled diagnostic (retained in the codebase as scripts/diagnose_model.py) evaluated the trained model on a held-out test split under three input conditions:</w:t>
+        <w:t>The five clinical classes are defined by the project brief in terms of arch height in centimetres (Severe Flat &lt; 2.7; Flat 2.7–3.5; Normal 3.6–5.5; High 5.6–6.4; Severe High &gt; 6.4). The ground-truth label is therefore a deterministic function of a single measured quantity. A controlled diagnostic (retained in the codebase as scripts/diagnose_model.py) evaluated the trained model on a held-out test split under three input conditions:</w:t>
       </w:r>
     </w:p>
     <w:p>
@@ -1419,6 +1404,15 @@
         <w:t xml:space="preserve"> described in Section 5 as the basis for delivery and acceptance.</w:t>
       </w:r>
     </w:p>
+    <w:p>
+      <w:pPr>
+        <w:jc w:val="both"/>
+        <w:rPr>
+          <w:sz w:val="16"/>
+          <w:szCs w:val="16"/>
+        </w:rPr>
+      </w:pPr>
+    </w:p>
     <w:tbl>
       <w:tblPr>
         <w:tblW w:w="9360" w:type="dxa"/>
@@ -1707,8 +1701,11 @@
     </w:tbl>
     <w:p>
       <w:pPr>
-        <w:spacing w:after="280"/>
-        <w:jc w:val="both"/>
+        <w:jc w:val="both"/>
+        <w:rPr>
+          <w:sz w:val="16"/>
+          <w:szCs w:val="16"/>
+        </w:rPr>
       </w:pPr>
     </w:p>
     <w:p>
@@ -2609,7 +2606,6 @@
   <w:style w:type="character" w:default="1" w:styleId="DefaultParagraphFont">
     <w:name w:val="Default Paragraph Font"/>
     <w:uiPriority w:val="1"/>
-    <w:semiHidden/>
     <w:unhideWhenUsed/>
   </w:style>
   <w:style w:type="table" w:default="1" w:styleId="TableNormal">

</xml_diff>